<commit_message>
Created another symbol for mux
Symbol for mux with separate vdd and vgnd
</commit_message>
<xml_diff>
--- a/Mux Using Transmission Gate.docx
+++ b/Mux Using Transmission Gate.docx
@@ -109,6 +109,7 @@
       <w:r>
         <w:rPr>
           <w:rFonts w:ascii="Times New Roman" w:hAnsi="Times New Roman" w:cs="Times New Roman"/>
+          <w:noProof/>
           <w:sz w:val="28"/>
           <w:szCs w:val="28"/>
         </w:rPr>
@@ -168,6 +169,7 @@
       <w:r>
         <w:rPr>
           <w:rFonts w:ascii="Times New Roman" w:hAnsi="Times New Roman" w:cs="Times New Roman"/>
+          <w:noProof/>
           <w:sz w:val="28"/>
           <w:szCs w:val="28"/>
         </w:rPr>
@@ -465,6 +467,7 @@
       <w:r>
         <w:rPr>
           <w:rFonts w:ascii="Times New Roman" w:hAnsi="Times New Roman" w:cs="Times New Roman"/>
+          <w:noProof/>
           <w:sz w:val="28"/>
           <w:szCs w:val="28"/>
         </w:rPr>
@@ -770,160 +773,337 @@
         <w:jc w:val="both"/>
         <w:rPr>
           <w:rFonts w:ascii="Times New Roman" w:hAnsi="Times New Roman" w:cs="Times New Roman"/>
-          <w:sz w:val="28"/>
-          <w:szCs w:val="28"/>
-        </w:rPr>
-      </w:pPr>
-    </w:p>
-    <w:p>
-      <w:pPr>
-        <w:jc w:val="both"/>
-        <w:rPr>
-          <w:rFonts w:ascii="Times New Roman" w:hAnsi="Times New Roman" w:cs="Times New Roman"/>
-          <w:sz w:val="28"/>
-          <w:szCs w:val="28"/>
-        </w:rPr>
-      </w:pPr>
-    </w:p>
-    <w:p>
-      <w:pPr>
-        <w:jc w:val="both"/>
-        <w:rPr>
-          <w:rFonts w:ascii="Times New Roman" w:hAnsi="Times New Roman" w:cs="Times New Roman"/>
-          <w:sz w:val="28"/>
-          <w:szCs w:val="28"/>
-        </w:rPr>
-      </w:pPr>
-    </w:p>
-    <w:p>
-      <w:pPr>
-        <w:jc w:val="both"/>
-        <w:rPr>
-          <w:rFonts w:ascii="Times New Roman" w:hAnsi="Times New Roman" w:cs="Times New Roman"/>
-          <w:sz w:val="28"/>
-          <w:szCs w:val="28"/>
-        </w:rPr>
-      </w:pPr>
-    </w:p>
-    <w:p>
-      <w:pPr>
-        <w:jc w:val="both"/>
-        <w:rPr>
-          <w:rFonts w:ascii="Times New Roman" w:hAnsi="Times New Roman" w:cs="Times New Roman"/>
-          <w:sz w:val="28"/>
-          <w:szCs w:val="28"/>
-        </w:rPr>
-      </w:pPr>
-    </w:p>
-    <w:p>
-      <w:pPr>
-        <w:jc w:val="both"/>
-        <w:rPr>
-          <w:rFonts w:ascii="Times New Roman" w:hAnsi="Times New Roman" w:cs="Times New Roman"/>
-          <w:sz w:val="28"/>
-          <w:szCs w:val="28"/>
-        </w:rPr>
-      </w:pPr>
-    </w:p>
-    <w:p>
-      <w:pPr>
-        <w:jc w:val="both"/>
-        <w:rPr>
-          <w:rFonts w:ascii="Times New Roman" w:hAnsi="Times New Roman" w:cs="Times New Roman"/>
-          <w:sz w:val="28"/>
-          <w:szCs w:val="28"/>
-        </w:rPr>
-      </w:pPr>
-    </w:p>
-    <w:p>
-      <w:pPr>
-        <w:jc w:val="both"/>
-        <w:rPr>
-          <w:rFonts w:ascii="Times New Roman" w:hAnsi="Times New Roman" w:cs="Times New Roman"/>
-          <w:sz w:val="28"/>
-          <w:szCs w:val="28"/>
-        </w:rPr>
-      </w:pPr>
-    </w:p>
-    <w:p>
-      <w:pPr>
-        <w:jc w:val="both"/>
-        <w:rPr>
-          <w:rFonts w:ascii="Times New Roman" w:hAnsi="Times New Roman" w:cs="Times New Roman"/>
-          <w:sz w:val="28"/>
-          <w:szCs w:val="28"/>
-        </w:rPr>
-      </w:pPr>
-    </w:p>
-    <w:p>
-      <w:pPr>
-        <w:jc w:val="both"/>
-        <w:rPr>
-          <w:rFonts w:ascii="Times New Roman" w:hAnsi="Times New Roman" w:cs="Times New Roman"/>
-          <w:sz w:val="28"/>
-          <w:szCs w:val="28"/>
-        </w:rPr>
-      </w:pPr>
-    </w:p>
-    <w:p>
-      <w:pPr>
-        <w:jc w:val="both"/>
-        <w:rPr>
-          <w:rFonts w:ascii="Times New Roman" w:hAnsi="Times New Roman" w:cs="Times New Roman"/>
-          <w:sz w:val="28"/>
-          <w:szCs w:val="28"/>
-        </w:rPr>
-      </w:pPr>
-    </w:p>
-    <w:p>
-      <w:pPr>
-        <w:jc w:val="both"/>
-        <w:rPr>
-          <w:rFonts w:ascii="Times New Roman" w:hAnsi="Times New Roman" w:cs="Times New Roman"/>
-          <w:sz w:val="28"/>
-          <w:szCs w:val="28"/>
-        </w:rPr>
-      </w:pPr>
-    </w:p>
-    <w:p>
-      <w:pPr>
-        <w:jc w:val="both"/>
-        <w:rPr>
-          <w:rFonts w:ascii="Times New Roman" w:hAnsi="Times New Roman" w:cs="Times New Roman"/>
-          <w:sz w:val="28"/>
-          <w:szCs w:val="28"/>
-        </w:rPr>
-      </w:pPr>
-    </w:p>
-    <w:p>
-      <w:pPr>
-        <w:jc w:val="both"/>
-        <w:rPr>
-          <w:rFonts w:ascii="Times New Roman" w:hAnsi="Times New Roman" w:cs="Times New Roman"/>
-          <w:sz w:val="28"/>
-          <w:szCs w:val="28"/>
-        </w:rPr>
-      </w:pPr>
-    </w:p>
-    <w:p>
-      <w:pPr>
-        <w:jc w:val="both"/>
-        <w:rPr>
-          <w:rFonts w:ascii="Times New Roman" w:hAnsi="Times New Roman" w:cs="Times New Roman"/>
-          <w:sz w:val="28"/>
-          <w:szCs w:val="28"/>
-        </w:rPr>
-      </w:pPr>
-    </w:p>
-    <w:p>
-      <w:pPr>
-        <w:jc w:val="both"/>
-        <w:rPr>
-          <w:rFonts w:ascii="Times New Roman" w:hAnsi="Times New Roman" w:cs="Times New Roman"/>
-          <w:sz w:val="28"/>
-          <w:szCs w:val="28"/>
-        </w:rPr>
-      </w:pPr>
+          <w:b/>
+          <w:bCs/>
+          <w:sz w:val="28"/>
+          <w:szCs w:val="28"/>
+        </w:rPr>
+      </w:pPr>
+      <w:r>
+        <w:rPr>
+          <w:rFonts w:ascii="Times New Roman" w:hAnsi="Times New Roman" w:cs="Times New Roman"/>
+          <w:b/>
+          <w:bCs/>
+          <w:sz w:val="28"/>
+          <w:szCs w:val="28"/>
+        </w:rPr>
+        <w:t>Designed a symbol for Mux</w:t>
+      </w:r>
+    </w:p>
+    <w:p>
+      <w:pPr>
+        <w:jc w:val="both"/>
+        <w:rPr>
+          <w:rFonts w:ascii="Times New Roman" w:hAnsi="Times New Roman" w:cs="Times New Roman"/>
+          <w:b/>
+          <w:bCs/>
+          <w:sz w:val="28"/>
+          <w:szCs w:val="28"/>
+        </w:rPr>
+      </w:pPr>
+      <w:r>
+        <w:rPr>
+          <w:rFonts w:ascii="Times New Roman" w:hAnsi="Times New Roman" w:cs="Times New Roman"/>
+          <w:b/>
+          <w:bCs/>
+          <w:sz w:val="28"/>
+          <w:szCs w:val="28"/>
+        </w:rPr>
+        <w:drawing>
+          <wp:inline distT="0" distB="0" distL="0" distR="0" wp14:anchorId="2F71C7C4" wp14:editId="120698EB">
+            <wp:extent cx="5731510" cy="2822575"/>
+            <wp:effectExtent l="0" t="0" r="2540" b="0"/>
+            <wp:docPr id="728951276" name="Picture 1"/>
+            <wp:cNvGraphicFramePr>
+              <a:graphicFrameLocks xmlns:a="http://schemas.openxmlformats.org/drawingml/2006/main" noChangeAspect="1"/>
+            </wp:cNvGraphicFramePr>
+            <a:graphic xmlns:a="http://schemas.openxmlformats.org/drawingml/2006/main">
+              <a:graphicData uri="http://schemas.openxmlformats.org/drawingml/2006/picture">
+                <pic:pic xmlns:pic="http://schemas.openxmlformats.org/drawingml/2006/picture">
+                  <pic:nvPicPr>
+                    <pic:cNvPr id="728951276" name=""/>
+                    <pic:cNvPicPr/>
+                  </pic:nvPicPr>
+                  <pic:blipFill>
+                    <a:blip r:embed="rId9"/>
+                    <a:stretch>
+                      <a:fillRect/>
+                    </a:stretch>
+                  </pic:blipFill>
+                  <pic:spPr>
+                    <a:xfrm>
+                      <a:off x="0" y="0"/>
+                      <a:ext cx="5731510" cy="2822575"/>
+                    </a:xfrm>
+                    <a:prstGeom prst="rect">
+                      <a:avLst/>
+                    </a:prstGeom>
+                  </pic:spPr>
+                </pic:pic>
+              </a:graphicData>
+            </a:graphic>
+          </wp:inline>
+        </w:drawing>
+      </w:r>
+    </w:p>
+    <w:p>
+      <w:pPr>
+        <w:jc w:val="both"/>
+        <w:rPr>
+          <w:rFonts w:ascii="Times New Roman" w:hAnsi="Times New Roman" w:cs="Times New Roman"/>
+          <w:sz w:val="28"/>
+          <w:szCs w:val="28"/>
+        </w:rPr>
+      </w:pPr>
+      <w:r>
+        <w:rPr>
+          <w:rFonts w:ascii="Times New Roman" w:hAnsi="Times New Roman" w:cs="Times New Roman"/>
+          <w:sz w:val="28"/>
+          <w:szCs w:val="28"/>
+        </w:rPr>
+        <w:drawing>
+          <wp:inline distT="0" distB="0" distL="0" distR="0" wp14:anchorId="77F4BBAA" wp14:editId="06228864">
+            <wp:extent cx="5731510" cy="4366260"/>
+            <wp:effectExtent l="0" t="0" r="2540" b="0"/>
+            <wp:docPr id="1401730923" name="Picture 1"/>
+            <wp:cNvGraphicFramePr>
+              <a:graphicFrameLocks xmlns:a="http://schemas.openxmlformats.org/drawingml/2006/main" noChangeAspect="1"/>
+            </wp:cNvGraphicFramePr>
+            <a:graphic xmlns:a="http://schemas.openxmlformats.org/drawingml/2006/main">
+              <a:graphicData uri="http://schemas.openxmlformats.org/drawingml/2006/picture">
+                <pic:pic xmlns:pic="http://schemas.openxmlformats.org/drawingml/2006/picture">
+                  <pic:nvPicPr>
+                    <pic:cNvPr id="1401730923" name=""/>
+                    <pic:cNvPicPr/>
+                  </pic:nvPicPr>
+                  <pic:blipFill>
+                    <a:blip r:embed="rId10"/>
+                    <a:stretch>
+                      <a:fillRect/>
+                    </a:stretch>
+                  </pic:blipFill>
+                  <pic:spPr>
+                    <a:xfrm>
+                      <a:off x="0" y="0"/>
+                      <a:ext cx="5731510" cy="4366260"/>
+                    </a:xfrm>
+                    <a:prstGeom prst="rect">
+                      <a:avLst/>
+                    </a:prstGeom>
+                  </pic:spPr>
+                </pic:pic>
+              </a:graphicData>
+            </a:graphic>
+          </wp:inline>
+        </w:drawing>
+      </w:r>
+    </w:p>
+    <w:p>
+      <w:pPr>
+        <w:jc w:val="both"/>
+        <w:rPr>
+          <w:rFonts w:ascii="Times New Roman" w:hAnsi="Times New Roman" w:cs="Times New Roman"/>
+          <w:sz w:val="28"/>
+          <w:szCs w:val="28"/>
+        </w:rPr>
+      </w:pPr>
+      <w:r>
+        <w:rPr>
+          <w:rFonts w:ascii="Times New Roman" w:hAnsi="Times New Roman" w:cs="Times New Roman"/>
+          <w:sz w:val="28"/>
+          <w:szCs w:val="28"/>
+        </w:rPr>
+        <w:lastRenderedPageBreak/>
+        <w:t xml:space="preserve">Above is the symbol for the 2:1 mux made using transmission gates. It has input pins D0, D1, select line S and output Y. I have connected the </w:t>
+      </w:r>
+      <w:proofErr w:type="spellStart"/>
+      <w:r>
+        <w:rPr>
+          <w:rFonts w:ascii="Times New Roman" w:hAnsi="Times New Roman" w:cs="Times New Roman"/>
+          <w:sz w:val="28"/>
+          <w:szCs w:val="28"/>
+        </w:rPr>
+        <w:t>vdd</w:t>
+      </w:r>
+      <w:proofErr w:type="spellEnd"/>
+      <w:r>
+        <w:rPr>
+          <w:rFonts w:ascii="Times New Roman" w:hAnsi="Times New Roman" w:cs="Times New Roman"/>
+          <w:sz w:val="28"/>
+          <w:szCs w:val="28"/>
+        </w:rPr>
+        <w:t xml:space="preserve"> and </w:t>
+      </w:r>
+      <w:proofErr w:type="spellStart"/>
+      <w:r>
+        <w:rPr>
+          <w:rFonts w:ascii="Times New Roman" w:hAnsi="Times New Roman" w:cs="Times New Roman"/>
+          <w:sz w:val="28"/>
+          <w:szCs w:val="28"/>
+        </w:rPr>
+        <w:t>vgnd</w:t>
+      </w:r>
+      <w:proofErr w:type="spellEnd"/>
+      <w:r>
+        <w:rPr>
+          <w:rFonts w:ascii="Times New Roman" w:hAnsi="Times New Roman" w:cs="Times New Roman"/>
+          <w:sz w:val="28"/>
+          <w:szCs w:val="28"/>
+        </w:rPr>
+        <w:t xml:space="preserve"> with respective 5V and ground to reduce pins in the symbol.</w:t>
+      </w:r>
+    </w:p>
+    <w:p>
+      <w:pPr>
+        <w:jc w:val="both"/>
+        <w:rPr>
+          <w:rFonts w:ascii="Times New Roman" w:hAnsi="Times New Roman" w:cs="Times New Roman"/>
+          <w:b/>
+          <w:bCs/>
+          <w:sz w:val="28"/>
+          <w:szCs w:val="28"/>
+        </w:rPr>
+      </w:pPr>
+      <w:r>
+        <w:rPr>
+          <w:rFonts w:ascii="Times New Roman" w:hAnsi="Times New Roman" w:cs="Times New Roman"/>
+          <w:b/>
+          <w:bCs/>
+          <w:sz w:val="28"/>
+          <w:szCs w:val="28"/>
+        </w:rPr>
+        <w:t>Testing:</w:t>
+      </w:r>
+    </w:p>
+    <w:p>
+      <w:pPr>
+        <w:jc w:val="both"/>
+        <w:rPr>
+          <w:rFonts w:ascii="Times New Roman" w:hAnsi="Times New Roman" w:cs="Times New Roman"/>
+          <w:b/>
+          <w:bCs/>
+          <w:sz w:val="28"/>
+          <w:szCs w:val="28"/>
+        </w:rPr>
+      </w:pPr>
+      <w:r>
+        <w:rPr>
+          <w:rFonts w:ascii="Times New Roman" w:hAnsi="Times New Roman" w:cs="Times New Roman"/>
+          <w:b/>
+          <w:bCs/>
+          <w:sz w:val="28"/>
+          <w:szCs w:val="28"/>
+        </w:rPr>
+        <w:drawing>
+          <wp:inline distT="0" distB="0" distL="0" distR="0" wp14:anchorId="62FCC4AB" wp14:editId="24D63ED3">
+            <wp:extent cx="5731510" cy="2246630"/>
+            <wp:effectExtent l="0" t="0" r="2540" b="1270"/>
+            <wp:docPr id="711045462" name="Picture 1"/>
+            <wp:cNvGraphicFramePr>
+              <a:graphicFrameLocks xmlns:a="http://schemas.openxmlformats.org/drawingml/2006/main" noChangeAspect="1"/>
+            </wp:cNvGraphicFramePr>
+            <a:graphic xmlns:a="http://schemas.openxmlformats.org/drawingml/2006/main">
+              <a:graphicData uri="http://schemas.openxmlformats.org/drawingml/2006/picture">
+                <pic:pic xmlns:pic="http://schemas.openxmlformats.org/drawingml/2006/picture">
+                  <pic:nvPicPr>
+                    <pic:cNvPr id="711045462" name=""/>
+                    <pic:cNvPicPr/>
+                  </pic:nvPicPr>
+                  <pic:blipFill>
+                    <a:blip r:embed="rId11"/>
+                    <a:stretch>
+                      <a:fillRect/>
+                    </a:stretch>
+                  </pic:blipFill>
+                  <pic:spPr>
+                    <a:xfrm>
+                      <a:off x="0" y="0"/>
+                      <a:ext cx="5731510" cy="2246630"/>
+                    </a:xfrm>
+                    <a:prstGeom prst="rect">
+                      <a:avLst/>
+                    </a:prstGeom>
+                  </pic:spPr>
+                </pic:pic>
+              </a:graphicData>
+            </a:graphic>
+          </wp:inline>
+        </w:drawing>
+      </w:r>
+    </w:p>
+    <w:p>
+      <w:pPr>
+        <w:jc w:val="both"/>
+        <w:rPr>
+          <w:rFonts w:ascii="Times New Roman" w:hAnsi="Times New Roman" w:cs="Times New Roman"/>
+          <w:b/>
+          <w:bCs/>
+          <w:sz w:val="28"/>
+          <w:szCs w:val="28"/>
+        </w:rPr>
+      </w:pPr>
+      <w:r>
+        <w:rPr>
+          <w:rFonts w:ascii="Times New Roman" w:hAnsi="Times New Roman" w:cs="Times New Roman"/>
+          <w:b/>
+          <w:bCs/>
+          <w:sz w:val="28"/>
+          <w:szCs w:val="28"/>
+        </w:rPr>
+        <w:t>Simulation Result:</w:t>
+      </w:r>
+    </w:p>
+    <w:p>
+      <w:pPr>
+        <w:jc w:val="both"/>
+        <w:rPr>
+          <w:rFonts w:ascii="Times New Roman" w:hAnsi="Times New Roman" w:cs="Times New Roman"/>
+          <w:b/>
+          <w:bCs/>
+          <w:sz w:val="28"/>
+          <w:szCs w:val="28"/>
+        </w:rPr>
+      </w:pPr>
+      <w:r>
+        <w:rPr>
+          <w:noProof/>
+        </w:rPr>
+        <w:drawing>
+          <wp:inline distT="0" distB="0" distL="0" distR="0" wp14:anchorId="49481EE1" wp14:editId="3C562F06">
+            <wp:extent cx="5767984" cy="2556164"/>
+            <wp:effectExtent l="0" t="0" r="4445" b="0"/>
+            <wp:docPr id="1076644361" name="Picture 1"/>
+            <wp:cNvGraphicFramePr>
+              <a:graphicFrameLocks xmlns:a="http://schemas.openxmlformats.org/drawingml/2006/main" noChangeAspect="1"/>
+            </wp:cNvGraphicFramePr>
+            <a:graphic xmlns:a="http://schemas.openxmlformats.org/drawingml/2006/main">
+              <a:graphicData uri="http://schemas.openxmlformats.org/drawingml/2006/picture">
+                <pic:pic xmlns:pic="http://schemas.openxmlformats.org/drawingml/2006/picture">
+                  <pic:nvPicPr>
+                    <pic:cNvPr id="1076644361" name=""/>
+                    <pic:cNvPicPr/>
+                  </pic:nvPicPr>
+                  <pic:blipFill>
+                    <a:blip r:embed="rId12"/>
+                    <a:stretch>
+                      <a:fillRect/>
+                    </a:stretch>
+                  </pic:blipFill>
+                  <pic:spPr>
+                    <a:xfrm>
+                      <a:off x="0" y="0"/>
+                      <a:ext cx="5771728" cy="2557823"/>
+                    </a:xfrm>
+                    <a:prstGeom prst="rect">
+                      <a:avLst/>
+                    </a:prstGeom>
+                  </pic:spPr>
+                </pic:pic>
+              </a:graphicData>
+            </a:graphic>
+          </wp:inline>
+        </w:drawing>
+      </w:r>
     </w:p>
     <w:p>
       <w:pPr>

</xml_diff>